<commit_message>
docs: use single default font
</commit_message>
<xml_diff>
--- a/scripts/skip_softmax_attention_backend.docx
+++ b/scripts/skip_softmax_attention_backend.docx
@@ -3,10 +3,11 @@
 <w:document xmlns:wpc="http://schemas.microsoft.com/office/word/2010/wordprocessingCanvas" xmlns:mo="http://schemas.microsoft.com/office/mac/office/2008/main" xmlns:mc="http://schemas.openxmlformats.org/markup-compatibility/2006" xmlns:mv="urn:schemas-microsoft-com:mac:vml" xmlns:o="urn:schemas-microsoft-com:office:office" xmlns:r="http://schemas.openxmlformats.org/officeDocument/2006/relationships" xmlns:m="http://schemas.openxmlformats.org/officeDocument/2006/math" xmlns:v="urn:schemas-microsoft-com:vml" xmlns:wp14="http://schemas.microsoft.com/office/word/2010/wordprocessingDrawing" xmlns:wp="http://schemas.openxmlformats.org/drawingml/2006/wordprocessingDrawing" xmlns:w10="urn:schemas-microsoft-com:office:word" xmlns:w="http://schemas.openxmlformats.org/wordprocessingml/2006/main" xmlns:w14="http://schemas.microsoft.com/office/word/2010/wordml" xmlns:wpg="http://schemas.microsoft.com/office/word/2010/wordprocessingGroup" xmlns:wpi="http://schemas.microsoft.com/office/word/2010/wordprocessingInk" xmlns:wne="http://schemas.microsoft.com/office/word/2006/wordml" xmlns:wps="http://schemas.microsoft.com/office/word/2010/wordprocessingShape" mc:Ignorable="w14 wp14">
   <w:body>
     <w:p>
-      <w:pPr>
-        <w:pStyle w:val="Title"/>
-      </w:pPr>
       <w:r>
+        <w:rPr>
+          <w:b/>
+          <w:sz w:val="32"/>
+        </w:rPr>
         <w:t>Skip-Softmax + SAGE Attention Backend — vLLM-Omni Integration</w:t>
       </w:r>
     </w:p>
@@ -14,18 +15,15 @@
       <w:r>
         <w:rPr>
           <w:i/>
-          <w:color w:val="707070"/>
         </w:rPr>
         <w:t>Verified against FlashInfer 0.6.12 and TensorRT-LLM sparse-attention docs. Algorithm: BLASST (arXiv 2512.12087).</w:t>
       </w:r>
     </w:p>
     <w:p>
-      <w:pPr>
-        <w:pStyle w:val="Heading1"/>
-      </w:pPr>
       <w:r>
         <w:rPr>
-          <w:color w:val="537A00"/>
+          <w:b/>
+          <w:sz w:val="26"/>
         </w:rPr>
         <w:t>1. User config (mirror TensorRT-LLM)</w:t>
       </w:r>
@@ -33,13 +31,9 @@
     <w:p>
       <w:pPr>
         <w:spacing w:after="120"/>
-        <w:ind w:left="200"/>
+        <w:ind w:left="280"/>
       </w:pPr>
       <w:r>
-        <w:rPr>
-          <w:rFonts w:ascii="Consolas" w:hAnsi="Consolas"/>
-          <w:sz w:val="18"/>
-        </w:rPr>
         <w:t>attention_backend: trtllm            # -&gt; FlashInfer trtllm-gen path</w:t>
         <w:br/>
         <w:t>sparse_attention_config:</w:t>
@@ -54,31 +48,28 @@
       </w:r>
     </w:p>
     <w:p>
-      <w:pPr>
-        <w:pStyle w:val="Heading1"/>
-      </w:pPr>
       <w:r>
         <w:rPr>
-          <w:color w:val="537A00"/>
+          <w:b/>
+          <w:sz w:val="26"/>
         </w:rPr>
         <w:t>2. Kernel — FlashInfer</w:t>
       </w:r>
     </w:p>
     <w:p>
       <w:r>
+        <w:rPr>
+          <w:i w:val="0"/>
+        </w:rPr>
         <w:t>flashinfer.prefill.trtllm_ragged_attention_deepseek(...):</w:t>
       </w:r>
     </w:p>
     <w:p>
       <w:pPr>
         <w:spacing w:after="120"/>
-        <w:ind w:left="200"/>
+        <w:ind w:left="280"/>
       </w:pPr>
       <w:r>
-        <w:rPr>
-          <w:rFonts w:ascii="Consolas" w:hAnsi="Consolas"/>
-          <w:sz w:val="18"/>
-        </w:rPr>
         <w:t>skip_softmax_threshold_scale_factor = factor   # threshold = factor / seqlen</w:t>
         <w:br/>
         <w:t>sage_attn_sfs           = (q_sf, k_sf, None, v_sf)   # dynamic FP8 block scales</w:t>
@@ -93,12 +84,10 @@
       </w:r>
     </w:p>
     <w:p>
-      <w:pPr>
-        <w:pStyle w:val="Heading1"/>
-      </w:pPr>
       <w:r>
         <w:rPr>
-          <w:color w:val="537A00"/>
+          <w:b/>
+          <w:sz w:val="26"/>
         </w:rPr>
         <w:t>3. Calibration — in checkpoint config.json (from ModelOpt)</w:t>
       </w:r>
@@ -106,13 +95,9 @@
     <w:p>
       <w:pPr>
         <w:spacing w:after="120"/>
-        <w:ind w:left="200"/>
+        <w:ind w:left="280"/>
       </w:pPr>
       <w:r>
-        <w:rPr>
-          <w:rFonts w:ascii="Consolas" w:hAnsi="Consolas"/>
-          <w:sz w:val="18"/>
-        </w:rPr>
         <w:t>"sparse_attention_config": {</w:t>
         <w:br/>
         <w:t xml:space="preserve">  "config_groups": {</w:t>
@@ -175,12 +160,10 @@
       </w:r>
     </w:p>
     <w:p>
-      <w:pPr>
-        <w:pStyle w:val="Heading1"/>
-      </w:pPr>
       <w:r>
         <w:rPr>
-          <w:color w:val="537A00"/>
+          <w:b/>
+          <w:sz w:val="26"/>
         </w:rPr>
         <w:t>4. vLLM-Omni to-do</w:t>
       </w:r>
@@ -598,10 +581,6 @@
     <w:name w:val="Normal"/>
     <w:qFormat/>
     <w:rsid w:val="00FC693F"/>
-    <w:rPr>
-      <w:rFonts w:ascii="Calibri" w:hAnsi="Calibri"/>
-      <w:sz w:val="22"/>
-    </w:rPr>
   </w:style>
   <w:style w:type="paragraph" w:styleId="Header">
     <w:name w:val="header"/>

</xml_diff>

<commit_message>
docs: add DiT(fixed L) vs LLM(varied L) settings section
</commit_message>
<xml_diff>
--- a/scripts/skip_softmax_attention_backend.docx
+++ b/scripts/skip_softmax_attention_backend.docx
@@ -165,7 +165,79 @@
           <w:b/>
           <w:sz w:val="26"/>
         </w:rPr>
-        <w:t>4. vLLM-Omni to-do</w:t>
+        <w:t>4. Choosing settings — DiT (fixed L) vs LLM (varied L)</w:t>
+      </w:r>
+    </w:p>
+    <w:p>
+      <w:r>
+        <w:rPr>
+          <w:i w:val="0"/>
+        </w:rPr>
+        <w:t>The kernel does threshold = factor / seqlen. The /seqlen part is what differs between DiT and LLM.</w:t>
+      </w:r>
+    </w:p>
+    <w:p>
+      <w:r>
+        <w:rPr>
+          <w:i w:val="0"/>
+        </w:rPr>
+        <w:t>DiT: sequence length L is FIXED per generation (known from H, W, frames, VAE downsample, patch):</w:t>
+      </w:r>
+    </w:p>
+    <w:p>
+      <w:pPr>
+        <w:spacing w:after="120"/>
+        <w:ind w:left="280"/>
+      </w:pPr>
+      <w:r>
+        <w:t>L = (H//8//patch) * (W//8//patch) * frames        # exact, known before denoise</w:t>
+        <w:br/>
+        <w:t>factor = a * exp(b * target_sparsity)             # from checkpoint per-group a,b</w:t>
+        <w:br/>
+        <w:t># L fixed -&gt; threshold=factor/L is constant across steps;</w:t>
+        <w:br/>
+        <w:t># compute factor ONCE per generation, not per step; only the timestep gate toggles.</w:t>
+      </w:r>
+    </w:p>
+    <w:p>
+      <w:pPr>
+        <w:pStyle w:val="ListBullet"/>
+      </w:pPr>
+      <w:r>
+        <w:t>/seqlen normalization is redundant for DiT (L fixed) but lets ONE calibration transfer across resolutions.</w:t>
+      </w:r>
+    </w:p>
+    <w:p>
+      <w:pPr>
+        <w:pStyle w:val="ListBullet"/>
+      </w:pPr>
+      <w:r>
+        <w:t>Calibrate per (resolution, frames) bucket - safe sparsity is resolution/content dependent; verify LPIPS per target resolution.</w:t>
+      </w:r>
+    </w:p>
+    <w:p>
+      <w:pPr>
+        <w:pStyle w:val="ListBullet"/>
+      </w:pPr>
+      <w:r>
+        <w:t>CUDA graph: L fixed + skip on/off by phase -&gt; static shapes; key graphs by (L, skip_enabled).</w:t>
+      </w:r>
+    </w:p>
+    <w:p>
+      <w:pPr>
+        <w:pStyle w:val="ListBullet"/>
+      </w:pPr>
+      <w:r>
+        <w:t>LLM (if ever): L varies (prompt + growing KV) -&gt; rely on /seqlen, recompute threshold per step; one calibrated 'a' carries across L.</w:t>
+      </w:r>
+    </w:p>
+    <w:p>
+      <w:r>
+        <w:rPr>
+          <w:b/>
+          <w:sz w:val="26"/>
+        </w:rPr>
+        <w:t>5. vLLM-Omni to-do</w:t>
       </w:r>
     </w:p>
     <w:p>
@@ -189,7 +261,15 @@
         <w:pStyle w:val="ListBullet"/>
       </w:pPr>
       <w:r>
-        <w:t>Gate skip by normalized denoise timestep; key CUDA graphs per disabled/enabled phase.</w:t>
+        <w:t>Compute L from the request; resolve factor ONCE per generation; gate skip by normalized denoise timestep.</w:t>
+      </w:r>
+    </w:p>
+    <w:p>
+      <w:pPr>
+        <w:pStyle w:val="ListBullet"/>
+      </w:pPr>
+      <w:r>
+        <w:t>Key CUDA graphs per (L, disabled/enabled phase).</w:t>
       </w:r>
     </w:p>
     <w:p>

</xml_diff>